<commit_message>
Strip references and phone number from public resume download
The site's resume link is public; remove reference contacts' personal
info and Byron's phone number before it's downloadable from GitHub Pages.

Co-Authored-By: Claude Sonnet 5 <noreply@anthropic.com>
</commit_message>
<xml_diff>
--- a/assets/ByronMutimusakwaResume.docx
+++ b/assets/ByronMutimusakwaResume.docx
@@ -48,7 +48,7 @@
           <w:sz w:val="19"/>
           <w:szCs w:val="19"/>
         </w:rPr>
-        <w:t xml:space="preserve"> </w:t>
+        <w:t xml:space="preserve"> | </w:t>
       </w:r>
       <w:r>
         <w:rPr>
@@ -57,7 +57,6 @@
           <w:sz w:val="19"/>
           <w:szCs w:val="19"/>
         </w:rPr>
-        <w:t>| +</w:t>
       </w:r>
       <w:r>
         <w:rPr>
@@ -66,7 +65,6 @@
           <w:sz w:val="19"/>
           <w:szCs w:val="19"/>
         </w:rPr>
-        <w:t>1 (</w:t>
       </w:r>
       <w:r>
         <w:rPr>
@@ -75,7 +73,6 @@
           <w:sz w:val="19"/>
           <w:szCs w:val="19"/>
         </w:rPr>
-        <w:t>765</w:t>
       </w:r>
       <w:r>
         <w:rPr>
@@ -84,7 +81,6 @@
           <w:sz w:val="19"/>
           <w:szCs w:val="19"/>
         </w:rPr>
-        <w:t xml:space="preserve">) </w:t>
       </w:r>
       <w:r>
         <w:rPr>
@@ -93,7 +89,6 @@
           <w:sz w:val="19"/>
           <w:szCs w:val="19"/>
         </w:rPr>
-        <w:t>713</w:t>
       </w:r>
       <w:r>
         <w:rPr>
@@ -102,7 +97,6 @@
           <w:sz w:val="19"/>
           <w:szCs w:val="19"/>
         </w:rPr>
-        <w:t xml:space="preserve"> </w:t>
       </w:r>
       <w:r>
         <w:rPr>
@@ -111,7 +105,6 @@
           <w:sz w:val="19"/>
           <w:szCs w:val="19"/>
         </w:rPr>
-        <w:t>9926</w:t>
       </w:r>
       <w:r>
         <w:rPr>
@@ -120,7 +113,6 @@
           <w:sz w:val="19"/>
           <w:szCs w:val="19"/>
         </w:rPr>
-        <w:t xml:space="preserve"> </w:t>
       </w:r>
       <w:r>
         <w:rPr>
@@ -129,7 +121,6 @@
           <w:sz w:val="19"/>
           <w:szCs w:val="19"/>
         </w:rPr>
-        <w:t>|</w:t>
       </w:r>
       <w:r>
         <w:rPr>
@@ -1459,328 +1450,6 @@
         </w:rPr>
         <w:t xml:space="preserve"> </w:t>
       </w:r>
-    </w:p>
-    <w:p>
-      <w:pPr>
-        <w:spacing w:after="80"/>
-        <w:rPr>
-          <w:rFonts w:ascii="Times New Roman" w:hAnsi="Times New Roman" w:cs="Times New Roman"/>
-          <w:color w:val="000000" w:themeColor="text1"/>
-        </w:rPr>
-      </w:pPr>
-    </w:p>
-    <w:p>
-      <w:pPr>
-        <w:pBdr>
-          <w:bottom w:val="single" w:sz="6" w:space="0" w:color="000000"/>
-        </w:pBdr>
-        <w:spacing w:before="260" w:after="100"/>
-        <w:rPr>
-          <w:rFonts w:ascii="Times New Roman" w:hAnsi="Times New Roman" w:cs="Times New Roman"/>
-        </w:rPr>
-      </w:pPr>
-      <w:r>
-        <w:rPr>
-          <w:rFonts w:ascii="Times New Roman" w:hAnsi="Times New Roman" w:cs="Times New Roman"/>
-          <w:b/>
-          <w:bCs/>
-          <w:sz w:val="22"/>
-          <w:szCs w:val="22"/>
-        </w:rPr>
-        <w:t>REFERENCES</w:t>
-      </w:r>
-    </w:p>
-    <w:p>
-      <w:pPr>
-        <w:tabs>
-          <w:tab w:val="right" w:pos="9360"/>
-        </w:tabs>
-        <w:spacing w:before="180" w:after="40"/>
-        <w:rPr>
-          <w:rFonts w:ascii="Times New Roman" w:hAnsi="Times New Roman" w:cs="Times New Roman"/>
-          <w:b/>
-          <w:bCs/>
-        </w:rPr>
-      </w:pPr>
-      <w:r>
-        <w:rPr>
-          <w:rFonts w:ascii="Times New Roman" w:hAnsi="Times New Roman" w:cs="Times New Roman"/>
-          <w:b/>
-          <w:bCs/>
-        </w:rPr>
-        <w:t>Ball State University</w:t>
-      </w:r>
-    </w:p>
-    <w:p>
-      <w:pPr>
-        <w:tabs>
-          <w:tab w:val="right" w:pos="9360"/>
-        </w:tabs>
-        <w:spacing w:before="180" w:after="40"/>
-        <w:rPr>
-          <w:rFonts w:ascii="Times New Roman" w:hAnsi="Times New Roman" w:cs="Times New Roman"/>
-          <w:sz w:val="22"/>
-          <w:szCs w:val="22"/>
-        </w:rPr>
-      </w:pPr>
-      <w:r>
-        <w:rPr>
-          <w:rFonts w:ascii="Times New Roman" w:hAnsi="Times New Roman" w:cs="Times New Roman"/>
-          <w:sz w:val="22"/>
-          <w:szCs w:val="22"/>
-        </w:rPr>
-        <w:t>Sonya Chapin - Academic Advisor</w:t>
-      </w:r>
-    </w:p>
-    <w:p>
-      <w:pPr>
-        <w:tabs>
-          <w:tab w:val="right" w:pos="9360"/>
-        </w:tabs>
-        <w:spacing w:before="180" w:after="40"/>
-        <w:rPr>
-          <w:rFonts w:ascii="Times New Roman" w:hAnsi="Times New Roman" w:cs="Times New Roman"/>
-          <w:sz w:val="22"/>
-          <w:szCs w:val="22"/>
-        </w:rPr>
-      </w:pPr>
-      <w:hyperlink r:id="rId6" w:history="1">
-        <w:r>
-          <w:rPr>
-            <w:rStyle w:val="Hyperlink"/>
-            <w:rFonts w:ascii="Times New Roman" w:hAnsi="Times New Roman" w:cs="Times New Roman"/>
-            <w:sz w:val="22"/>
-            <w:szCs w:val="22"/>
-          </w:rPr>
-          <w:t>sonya.chapin@bsu.edu</w:t>
-        </w:r>
-      </w:hyperlink>
-    </w:p>
-    <w:p>
-      <w:pPr>
-        <w:tabs>
-          <w:tab w:val="right" w:pos="9360"/>
-        </w:tabs>
-        <w:spacing w:before="180" w:after="40"/>
-        <w:rPr>
-          <w:rFonts w:ascii="Times New Roman" w:hAnsi="Times New Roman" w:cs="Times New Roman"/>
-          <w:sz w:val="22"/>
-          <w:szCs w:val="22"/>
-        </w:rPr>
-      </w:pPr>
-      <w:r>
-        <w:rPr>
-          <w:rFonts w:ascii="Times New Roman" w:hAnsi="Times New Roman" w:cs="Times New Roman"/>
-          <w:sz w:val="22"/>
-          <w:szCs w:val="22"/>
-        </w:rPr>
-        <w:t>+17652853762</w:t>
-      </w:r>
-    </w:p>
-    <w:p>
-      <w:pPr>
-        <w:tabs>
-          <w:tab w:val="right" w:pos="9360"/>
-        </w:tabs>
-        <w:spacing w:before="180" w:after="40"/>
-        <w:rPr>
-          <w:rFonts w:ascii="Times New Roman" w:hAnsi="Times New Roman" w:cs="Times New Roman"/>
-        </w:rPr>
-      </w:pPr>
-    </w:p>
-    <w:p>
-      <w:pPr>
-        <w:tabs>
-          <w:tab w:val="right" w:pos="9360"/>
-        </w:tabs>
-        <w:spacing w:before="180" w:after="40"/>
-        <w:rPr>
-          <w:rFonts w:ascii="Times New Roman" w:hAnsi="Times New Roman" w:cs="Times New Roman"/>
-          <w:b/>
-          <w:bCs/>
-        </w:rPr>
-      </w:pPr>
-      <w:r>
-        <w:rPr>
-          <w:rFonts w:ascii="Times New Roman" w:hAnsi="Times New Roman" w:cs="Times New Roman"/>
-          <w:b/>
-          <w:bCs/>
-        </w:rPr>
-        <w:t>Navigating Security</w:t>
-      </w:r>
-    </w:p>
-    <w:p>
-      <w:pPr>
-        <w:tabs>
-          <w:tab w:val="right" w:pos="9360"/>
-        </w:tabs>
-        <w:spacing w:before="180" w:after="40"/>
-        <w:rPr>
-          <w:rFonts w:ascii="Times New Roman" w:hAnsi="Times New Roman" w:cs="Times New Roman"/>
-          <w:sz w:val="22"/>
-          <w:szCs w:val="22"/>
-        </w:rPr>
-      </w:pPr>
-      <w:r>
-        <w:rPr>
-          <w:rFonts w:ascii="Times New Roman" w:hAnsi="Times New Roman" w:cs="Times New Roman"/>
-          <w:sz w:val="22"/>
-          <w:szCs w:val="22"/>
-        </w:rPr>
-        <w:t>Tadiwa Kadango</w:t>
-      </w:r>
-    </w:p>
-    <w:p>
-      <w:pPr>
-        <w:tabs>
-          <w:tab w:val="right" w:pos="9360"/>
-        </w:tabs>
-        <w:spacing w:before="180" w:after="40"/>
-        <w:rPr>
-          <w:rFonts w:ascii="Times New Roman" w:hAnsi="Times New Roman" w:cs="Times New Roman"/>
-          <w:sz w:val="22"/>
-          <w:szCs w:val="22"/>
-        </w:rPr>
-      </w:pPr>
-      <w:hyperlink r:id="rId7" w:history="1">
-        <w:r>
-          <w:rPr>
-            <w:rStyle w:val="Hyperlink"/>
-            <w:rFonts w:ascii="Times New Roman" w:hAnsi="Times New Roman" w:cs="Times New Roman"/>
-            <w:sz w:val="22"/>
-            <w:szCs w:val="22"/>
-          </w:rPr>
-          <w:t>tadi@navigatingsecurity.net</w:t>
-        </w:r>
-      </w:hyperlink>
-    </w:p>
-    <w:p>
-      <w:pPr>
-        <w:tabs>
-          <w:tab w:val="right" w:pos="9360"/>
-        </w:tabs>
-        <w:spacing w:before="180" w:after="40"/>
-        <w:rPr>
-          <w:rFonts w:ascii="Times New Roman" w:hAnsi="Times New Roman" w:cs="Times New Roman"/>
-          <w:sz w:val="22"/>
-          <w:szCs w:val="22"/>
-        </w:rPr>
-      </w:pPr>
-      <w:r>
-        <w:rPr>
-          <w:rFonts w:ascii="Times New Roman" w:hAnsi="Times New Roman" w:cs="Times New Roman"/>
-          <w:sz w:val="22"/>
-          <w:szCs w:val="22"/>
-        </w:rPr>
-        <w:t>+14845976181</w:t>
-      </w:r>
-    </w:p>
-    <w:p>
-      <w:pPr>
-        <w:tabs>
-          <w:tab w:val="right" w:pos="9360"/>
-        </w:tabs>
-        <w:spacing w:before="180" w:after="40"/>
-        <w:rPr>
-          <w:rFonts w:ascii="Times New Roman" w:hAnsi="Times New Roman" w:cs="Times New Roman"/>
-        </w:rPr>
-      </w:pPr>
-    </w:p>
-    <w:p>
-      <w:pPr>
-        <w:tabs>
-          <w:tab w:val="right" w:pos="9360"/>
-        </w:tabs>
-        <w:spacing w:before="180" w:after="40"/>
-        <w:rPr>
-          <w:rFonts w:ascii="Times New Roman" w:hAnsi="Times New Roman" w:cs="Times New Roman"/>
-          <w:b/>
-          <w:bCs/>
-        </w:rPr>
-      </w:pPr>
-      <w:r>
-        <w:rPr>
-          <w:rFonts w:ascii="Times New Roman" w:hAnsi="Times New Roman" w:cs="Times New Roman"/>
-          <w:b/>
-          <w:bCs/>
-        </w:rPr>
-        <w:t>Zimbabwe Women’s Microfinance Bank</w:t>
-      </w:r>
-    </w:p>
-    <w:p>
-      <w:pPr>
-        <w:tabs>
-          <w:tab w:val="right" w:pos="9360"/>
-        </w:tabs>
-        <w:spacing w:before="180" w:after="40"/>
-        <w:rPr>
-          <w:rFonts w:ascii="Times New Roman" w:hAnsi="Times New Roman" w:cs="Times New Roman"/>
-          <w:sz w:val="22"/>
-          <w:szCs w:val="22"/>
-        </w:rPr>
-      </w:pPr>
-      <w:r>
-        <w:rPr>
-          <w:rFonts w:ascii="Times New Roman" w:hAnsi="Times New Roman" w:cs="Times New Roman"/>
-          <w:sz w:val="22"/>
-          <w:szCs w:val="22"/>
-        </w:rPr>
-        <w:t>Otilia Murambiwa</w:t>
-      </w:r>
-    </w:p>
-    <w:p>
-      <w:pPr>
-        <w:tabs>
-          <w:tab w:val="right" w:pos="9360"/>
-        </w:tabs>
-        <w:spacing w:before="180" w:after="40"/>
-        <w:rPr>
-          <w:rFonts w:ascii="Times New Roman" w:hAnsi="Times New Roman" w:cs="Times New Roman"/>
-          <w:sz w:val="22"/>
-          <w:szCs w:val="22"/>
-        </w:rPr>
-      </w:pPr>
-      <w:hyperlink r:id="rId8" w:history="1">
-        <w:r>
-          <w:rPr>
-            <w:rStyle w:val="Hyperlink"/>
-            <w:rFonts w:ascii="Times New Roman" w:hAnsi="Times New Roman" w:cs="Times New Roman"/>
-            <w:sz w:val="22"/>
-            <w:szCs w:val="22"/>
-          </w:rPr>
-          <w:t>otilia.murambiwa@womensbank.co.zw</w:t>
-        </w:r>
-      </w:hyperlink>
-    </w:p>
-    <w:p>
-      <w:pPr>
-        <w:tabs>
-          <w:tab w:val="right" w:pos="9360"/>
-        </w:tabs>
-        <w:spacing w:before="180" w:after="40"/>
-        <w:rPr>
-          <w:rFonts w:ascii="Times New Roman" w:hAnsi="Times New Roman" w:cs="Times New Roman"/>
-          <w:sz w:val="22"/>
-          <w:szCs w:val="22"/>
-        </w:rPr>
-      </w:pPr>
-      <w:r>
-        <w:rPr>
-          <w:rFonts w:ascii="Times New Roman" w:hAnsi="Times New Roman" w:cs="Times New Roman"/>
-          <w:sz w:val="22"/>
-          <w:szCs w:val="22"/>
-        </w:rPr>
-        <w:t>+263773896286</w:t>
-      </w:r>
-    </w:p>
-    <w:p>
-      <w:pPr>
-        <w:spacing w:after="80"/>
-        <w:rPr>
-          <w:rFonts w:ascii="Times New Roman" w:hAnsi="Times New Roman" w:cs="Times New Roman"/>
-          <w:color w:val="000000" w:themeColor="text1"/>
-        </w:rPr>
-      </w:pPr>
     </w:p>
     <w:sectPr>
       <w:pgSz w:w="12240" w:h="15840"/>

</xml_diff>